<commit_message>
Modifiche alla procedura di Migrazione
</commit_message>
<xml_diff>
--- a/docs/ProceduraDiMigrazione/Procedura_migrazione_20200305.docx
+++ b/docs/ProceduraDiMigrazione/Procedura_migrazione_20200305.docx
@@ -1088,16 +1088,53 @@
         </w:rPr>
         <w:t>”</w:t>
       </w:r>
-    </w:p>
-    <w:p>
-      <w:pPr>
-        <w:rPr>
-          <w:sz w:val="24"/>
-          <w:szCs w:val="24"/>
-        </w:rPr>
-      </w:pPr>
-      <w:bookmarkStart w:id="1" w:name="_GoBack"/>
-      <w:bookmarkEnd w:id="1"/>
+      <w:r>
+        <w:rPr>
+          <w:sz w:val="24"/>
+          <w:szCs w:val="24"/>
+        </w:rPr>
+        <w:t xml:space="preserve">: è possibile scaricarlo tramite </w:t>
+      </w:r>
+      <w:proofErr w:type="spellStart"/>
+      <w:r>
+        <w:rPr>
+          <w:sz w:val="24"/>
+          <w:szCs w:val="24"/>
+        </w:rPr>
+        <w:t>FileZilla</w:t>
+      </w:r>
+      <w:proofErr w:type="spellEnd"/>
+      <w:r>
+        <w:rPr>
+          <w:sz w:val="24"/>
+          <w:szCs w:val="24"/>
+        </w:rPr>
+        <w:t xml:space="preserve">. Qualora un backup aggiornato non sia presente è necessario lanciare un </w:t>
+      </w:r>
+      <w:proofErr w:type="spellStart"/>
+      <w:r>
+        <w:rPr>
+          <w:sz w:val="24"/>
+          <w:szCs w:val="24"/>
+        </w:rPr>
+        <w:t>backup_manualmente</w:t>
+      </w:r>
+      <w:proofErr w:type="spellEnd"/>
+      <w:r>
+        <w:rPr>
+          <w:sz w:val="24"/>
+          <w:szCs w:val="24"/>
+        </w:rPr>
+        <w:t xml:space="preserve">. </w:t>
+      </w:r>
+    </w:p>
+    <w:p>
+      <w:pPr>
+        <w:rPr>
+          <w:sz w:val="24"/>
+          <w:szCs w:val="24"/>
+        </w:rPr>
+      </w:pPr>
     </w:p>
     <w:p>
       <w:pPr>
@@ -1137,14 +1174,6 @@
           <w:szCs w:val="24"/>
         </w:rPr>
       </w:pPr>
-    </w:p>
-    <w:p>
-      <w:pPr>
-        <w:rPr>
-          <w:sz w:val="24"/>
-          <w:szCs w:val="24"/>
-        </w:rPr>
-      </w:pPr>
       <w:r>
         <w:rPr>
           <w:sz w:val="24"/>
@@ -1158,7 +1187,21 @@
           <w:sz w:val="24"/>
           <w:szCs w:val="24"/>
         </w:rPr>
-        <w:t>Bakcup</w:t>
+        <w:t>Bac</w:t>
+      </w:r>
+      <w:r>
+        <w:rPr>
+          <w:sz w:val="24"/>
+          <w:szCs w:val="24"/>
+        </w:rPr>
+        <w:t>k_</w:t>
+      </w:r>
+      <w:r>
+        <w:rPr>
+          <w:sz w:val="24"/>
+          <w:szCs w:val="24"/>
+        </w:rPr>
+        <w:t>up</w:t>
       </w:r>
       <w:proofErr w:type="spellEnd"/>
       <w:r>
@@ -1230,6 +1273,23 @@
           <w:lang w:val="en-GB"/>
         </w:rPr>
         <w:t>"</w:t>
+      </w:r>
+    </w:p>
+    <w:p>
+      <w:pPr>
+        <w:rPr>
+          <w:sz w:val="24"/>
+          <w:szCs w:val="24"/>
+          <w:lang w:val="en-GB"/>
+        </w:rPr>
+      </w:pPr>
+      <w:r>
+        <w:rPr>
+          <w:sz w:val="24"/>
+          <w:szCs w:val="24"/>
+          <w:lang w:val="en-GB"/>
+        </w:rPr>
+        <w:t>Password: eVV1va09</w:t>
       </w:r>
     </w:p>
     <w:p>
@@ -1358,13 +1418,18 @@
       </w:r>
       <w:proofErr w:type="spellEnd"/>
       <w:r>
-        <w:t xml:space="preserve"> ed alla posizione della chiave di autenticazione (file .</w:t>
+        <w:t xml:space="preserve"> ed alla posizione della chiave di autenticazione (</w:t>
+      </w:r>
+      <w:proofErr w:type="gramStart"/>
+      <w:r>
+        <w:t>file .</w:t>
       </w:r>
       <w:proofErr w:type="spellStart"/>
       <w:r>
         <w:t>pem</w:t>
       </w:r>
       <w:proofErr w:type="spellEnd"/>
+      <w:proofErr w:type="gramEnd"/>
       <w:r>
         <w:t>):</w:t>
       </w:r>
@@ -1816,10 +1881,12 @@
         <w:t xml:space="preserve"> utilizzando la funzione </w:t>
       </w:r>
       <w:proofErr w:type="spellStart"/>
+      <w:proofErr w:type="gramStart"/>
       <w:r>
         <w:t>cerca.vert</w:t>
       </w:r>
       <w:proofErr w:type="spellEnd"/>
+      <w:proofErr w:type="gramEnd"/>
       <w:r>
         <w:t xml:space="preserve"> nel file </w:t>
       </w:r>
@@ -1855,23 +1922,38 @@
         <w:rPr>
           <w:u w:val="single"/>
         </w:rPr>
-        <w:t xml:space="preserve"> (DB2 n DB3 , dove “n” significa “intersecato”)</w:t>
-      </w:r>
-      <w:r>
-        <w:t xml:space="preserve">. Affiancare quindi le colonne di DB2 a quelle di DB2nDB3 per “sottrarre” le 2 colonne, in modo da avere un’ulteriore colonna con la lista delle funzioni che sono in DB2 ma che non sono in DB3, che sono esattamente le funzioni che dobbiamo importare. </w:t>
-      </w:r>
-      <w:r>
-        <w:t xml:space="preserve">Una volta ottenuta tale lista, scriverla </w:t>
+        <w:t xml:space="preserve"> (DB2 n DB</w:t>
+      </w:r>
+      <w:proofErr w:type="gramStart"/>
+      <w:r>
+        <w:rPr>
+          <w:u w:val="single"/>
+        </w:rPr>
+        <w:t>3 ,</w:t>
+      </w:r>
+      <w:proofErr w:type="gramEnd"/>
+      <w:r>
+        <w:rPr>
+          <w:u w:val="single"/>
+        </w:rPr>
+        <w:t xml:space="preserve"> dove “n” significa “intersecato”)</w:t>
+      </w:r>
+      <w:r>
+        <w:t xml:space="preserve">. Affiancare </w:t>
       </w:r>
       <w:r>
         <w:lastRenderedPageBreak/>
-        <w:t>nel file word “</w:t>
+        <w:t xml:space="preserve">quindi le colonne di DB2 a quelle di DB2nDB3 per “sottrarre” le 2 colonne, in modo da avere un’ulteriore colonna con la lista delle funzioni che sono in DB2 ma che non sono in DB3, che sono esattamente le funzioni che dobbiamo importare. </w:t>
+      </w:r>
+      <w:r>
+        <w:t>Una volta ottenuta tale lista, scriverla nel file word “</w:t>
       </w:r>
       <w:proofErr w:type="spellStart"/>
       <w:r>
         <w:t>funzioni_gorico_goricoprod</w:t>
       </w:r>
       <w:proofErr w:type="spellEnd"/>
+      <w:proofErr w:type="gramStart"/>
       <w:r>
         <w:t xml:space="preserve">” </w:t>
       </w:r>
@@ -1879,7 +1961,11 @@
         <w:t>,</w:t>
       </w:r>
       <w:r>
-        <w:t>terzo capitolo</w:t>
+        <w:t>terzo</w:t>
+      </w:r>
+      <w:proofErr w:type="gramEnd"/>
+      <w:r>
+        <w:t xml:space="preserve"> capitolo</w:t>
       </w:r>
       <w:r>
         <w:t xml:space="preserve"> “</w:t>
@@ -2069,12 +2155,17 @@
       <w:r>
         <w:t>grc_lista_definizioni_</w:t>
       </w:r>
+      <w:proofErr w:type="gramStart"/>
       <w:r>
         <w:t>funzioni</w:t>
       </w:r>
       <w:proofErr w:type="spellEnd"/>
       <w:r>
-        <w:t xml:space="preserve">() </w:t>
+        <w:t>(</w:t>
+      </w:r>
+      <w:proofErr w:type="gramEnd"/>
+      <w:r>
+        <w:t xml:space="preserve">) </w:t>
       </w:r>
       <w:r>
         <w:t>analogamente a quanto fatto per la funzione “</w:t>
@@ -2091,12 +2182,17 @@
       <w:r>
         <w:t>grc_lista_definizioni_</w:t>
       </w:r>
+      <w:proofErr w:type="gramStart"/>
       <w:r>
         <w:t>funzioni</w:t>
       </w:r>
       <w:proofErr w:type="spellEnd"/>
       <w:r>
-        <w:t>()</w:t>
+        <w:t>(</w:t>
+      </w:r>
+      <w:proofErr w:type="gramEnd"/>
+      <w:r>
+        <w:t>)</w:t>
       </w:r>
       <w:r>
         <w:t xml:space="preserve">” restituisce in </w:t>
@@ -2241,7 +2337,15 @@
           <w:b/>
           <w:bCs/>
         </w:rPr>
-        <w:t>FUNZIONI IN DB2 CHE NON SONO IN DB3 (DB2-DB3)”</w:t>
+        <w:t>FUNZIONI IN DB2 CHE NON SONO IN DB3 (DB2-DB3)</w:t>
+      </w:r>
+      <w:proofErr w:type="gramStart"/>
+      <w:r>
+        <w:rPr>
+          <w:b/>
+          <w:bCs/>
+        </w:rPr>
+        <w:t>”</w:t>
       </w:r>
       <w:r>
         <w:rPr>
@@ -2255,7 +2359,15 @@
           <w:b/>
           <w:bCs/>
         </w:rPr>
-        <w:t xml:space="preserve">. </w:t>
+        <w:t>.</w:t>
+      </w:r>
+      <w:proofErr w:type="gramEnd"/>
+      <w:r>
+        <w:rPr>
+          <w:b/>
+          <w:bCs/>
+        </w:rPr>
+        <w:t xml:space="preserve"> </w:t>
       </w:r>
       <w:r>
         <w:t>Per ottenerlo dobbiamo sfruttare la tabella “</w:t>
@@ -2270,11 +2382,19 @@
       </w:r>
       <w:proofErr w:type="spellStart"/>
       <w:r>
-        <w:t>grc_lista_definizioni_funzioni_da_importare</w:t>
-      </w:r>
-      <w:proofErr w:type="spellEnd"/>
-      <w:r>
-        <w:t xml:space="preserve">()”  e la </w:t>
+        <w:t>grc_lista_definizioni_funzioni_da_</w:t>
+      </w:r>
+      <w:proofErr w:type="gramStart"/>
+      <w:r>
+        <w:t>importare</w:t>
+      </w:r>
+      <w:proofErr w:type="spellEnd"/>
+      <w:r>
+        <w:t>(</w:t>
+      </w:r>
+      <w:proofErr w:type="gramEnd"/>
+      <w:r>
+        <w:t xml:space="preserve">)”  e la </w:t>
       </w:r>
       <w:proofErr w:type="spellStart"/>
       <w:r>
@@ -2305,11 +2425,19 @@
       </w:r>
       <w:proofErr w:type="spellStart"/>
       <w:r>
-        <w:t>grc_lista_definizioni_funzioni_da_importare</w:t>
-      </w:r>
-      <w:proofErr w:type="spellEnd"/>
-      <w:r>
-        <w:t xml:space="preserve">()”  che restituisce l’elenco delle definizioni delle funzioni che sono in DB2 ma non sono in DB3. Copiare tale lista nel capitolo 6 e </w:t>
+        <w:t>grc_lista_definizioni_funzioni_da_</w:t>
+      </w:r>
+      <w:proofErr w:type="gramStart"/>
+      <w:r>
+        <w:t>importare</w:t>
+      </w:r>
+      <w:proofErr w:type="spellEnd"/>
+      <w:r>
+        <w:t>(</w:t>
+      </w:r>
+      <w:proofErr w:type="gramEnd"/>
+      <w:r>
+        <w:t xml:space="preserve">)”  che restituisce l’elenco delle definizioni delle funzioni che sono in DB2 ma non sono in DB3. Copiare tale lista nel capitolo 6 e </w:t>
       </w:r>
       <w:proofErr w:type="spellStart"/>
       <w:r>
@@ -2403,8 +2531,13 @@
         <w:t>csv</w:t>
       </w:r>
       <w:proofErr w:type="spellEnd"/>
-      <w:r>
-        <w:t xml:space="preserve">”.Una volta fatto, andare su </w:t>
+      <w:proofErr w:type="gramStart"/>
+      <w:r>
+        <w:t>”.Una</w:t>
+      </w:r>
+      <w:proofErr w:type="gramEnd"/>
+      <w:r>
+        <w:t xml:space="preserve"> volta fatto, andare su </w:t>
       </w:r>
       <w:proofErr w:type="spellStart"/>
       <w:r>
@@ -2442,7 +2575,15 @@
         <w:sym w:font="Wingdings" w:char="F0E0"/>
       </w:r>
       <w:r>
-        <w:t xml:space="preserve"> file name : “transcodifiche.csv”</w:t>
+        <w:t xml:space="preserve"> file </w:t>
+      </w:r>
+      <w:proofErr w:type="gramStart"/>
+      <w:r>
+        <w:t>name :</w:t>
+      </w:r>
+      <w:proofErr w:type="gramEnd"/>
+      <w:r>
+        <w:t xml:space="preserve"> “transcodifiche.csv”</w:t>
       </w:r>
       <w:r>
         <w:t xml:space="preserve"> con i soliti parametri. Questo procedimento permette il </w:t>
@@ -2481,11 +2622,19 @@
       </w:r>
       <w:proofErr w:type="spellStart"/>
       <w:r>
-        <w:t>anagrafiche_id_cod_cognome</w:t>
-      </w:r>
-      <w:proofErr w:type="spellEnd"/>
-      <w:r>
-        <w:t xml:space="preserve"> : motivo sconosciuto</w:t>
+        <w:t>anagrafiche_id_cod_</w:t>
+      </w:r>
+      <w:proofErr w:type="gramStart"/>
+      <w:r>
+        <w:t>cognome</w:t>
+      </w:r>
+      <w:proofErr w:type="spellEnd"/>
+      <w:r>
+        <w:t xml:space="preserve"> :</w:t>
+      </w:r>
+      <w:proofErr w:type="gramEnd"/>
+      <w:r>
+        <w:t xml:space="preserve"> motivo sconosciuto</w:t>
       </w:r>
     </w:p>
     <w:p>
@@ -2501,27 +2650,41 @@
       </w:r>
       <w:proofErr w:type="spellStart"/>
       <w:r>
+        <w:t>grc_accoda_trattamenti_</w:t>
+      </w:r>
+      <w:proofErr w:type="gramStart"/>
+      <w:r>
+        <w:t>dati</w:t>
+      </w:r>
+      <w:proofErr w:type="spellEnd"/>
+      <w:r>
+        <w:t xml:space="preserve"> :</w:t>
+      </w:r>
+      <w:proofErr w:type="gramEnd"/>
+      <w:r>
+        <w:t xml:space="preserve"> questo perché DB2 ha 3 funzioni con lo stesso nome “</w:t>
+      </w:r>
+      <w:proofErr w:type="spellStart"/>
+      <w:r>
         <w:t>grc_accoda_trattamenti_dati</w:t>
       </w:r>
       <w:proofErr w:type="spellEnd"/>
       <w:r>
-        <w:t xml:space="preserve"> : questo perché DB2 ha 3 funzioni con lo stesso nome “</w:t>
-      </w:r>
-      <w:proofErr w:type="spellStart"/>
-      <w:r>
-        <w:t>grc_accoda_trattamenti_dati</w:t>
-      </w:r>
-      <w:proofErr w:type="spellEnd"/>
-      <w:r>
         <w:t xml:space="preserve">” e DB3 ne ha 1. La funzione </w:t>
       </w:r>
       <w:proofErr w:type="spellStart"/>
+      <w:proofErr w:type="gramStart"/>
       <w:r>
         <w:t>cerca.vert</w:t>
       </w:r>
       <w:proofErr w:type="spellEnd"/>
-      <w:r>
-        <w:t xml:space="preserve"> non segnala il fatto che DB2 ne ha tre e DB3 una, trova semplicemente la corrispondenza e non segnala nulla. Per tal motivo le 2 funzioni mancanti vanno aggiunte a mano.</w:t>
+      <w:proofErr w:type="gramEnd"/>
+      <w:r>
+        <w:t xml:space="preserve"> non segnala il </w:t>
+      </w:r>
+      <w:r>
+        <w:lastRenderedPageBreak/>
+        <w:t>fatto che DB2 ne ha tre e DB3 una, trova semplicemente la corrispondenza e non segnala nulla. Per tal motivo le 2 funzioni mancanti vanno aggiunte a mano.</w:t>
       </w:r>
     </w:p>
     <w:p>
@@ -2537,11 +2700,19 @@
       </w:r>
       <w:proofErr w:type="spellStart"/>
       <w:r>
-        <w:t>grc_accodamentoperrischioperativi</w:t>
-      </w:r>
-      <w:proofErr w:type="spellEnd"/>
-      <w:r>
-        <w:t xml:space="preserve"> : stesso motivo spiegato sopra </w:t>
+        <w:t>grc_</w:t>
+      </w:r>
+      <w:proofErr w:type="gramStart"/>
+      <w:r>
+        <w:t>accodamentoperrischioperativi</w:t>
+      </w:r>
+      <w:proofErr w:type="spellEnd"/>
+      <w:r>
+        <w:t xml:space="preserve"> :</w:t>
+      </w:r>
+      <w:proofErr w:type="gramEnd"/>
+      <w:r>
+        <w:t xml:space="preserve"> stesso motivo spiegato sopra </w:t>
       </w:r>
       <w:r>
         <w:sym w:font="Wingdings" w:char="F0E0"/>
@@ -2623,7 +2794,29 @@
           <w:sz w:val="24"/>
           <w:szCs w:val="24"/>
         </w:rPr>
-        <w:t>: sono i capitoli delle liste e delle definizioni superflui o possono servire come backup? Alla fine si può fare tutto anche senza file word</w:t>
+        <w:t xml:space="preserve">: sono i capitoli delle liste e delle definizioni superflui o possono servire come backup? </w:t>
+      </w:r>
+      <w:proofErr w:type="gramStart"/>
+      <w:r>
+        <w:rPr>
+          <w:b/>
+          <w:bCs/>
+          <w:color w:val="FF0000"/>
+          <w:sz w:val="24"/>
+          <w:szCs w:val="24"/>
+        </w:rPr>
+        <w:t>Alla fine</w:t>
+      </w:r>
+      <w:proofErr w:type="gramEnd"/>
+      <w:r>
+        <w:rPr>
+          <w:b/>
+          <w:bCs/>
+          <w:color w:val="FF0000"/>
+          <w:sz w:val="24"/>
+          <w:szCs w:val="24"/>
+        </w:rPr>
+        <w:t xml:space="preserve"> si può fare tutto anche senza file word</w:t>
       </w:r>
       <w:r>
         <w:rPr>
@@ -2790,7 +2983,23 @@
           <w:sz w:val="24"/>
           <w:szCs w:val="24"/>
         </w:rPr>
-        <w:t xml:space="preserve"> da trasferire da DB2 a DB3 sono state in totale 16. Ho optato quindi per un procedimento “manuale” di copia-incollaggio che è durato 5 minuti. In un’altra situazione, dove il copia-incollaggio dovesse risultare troppo oneroso, si può certamente eseguire una procedura analoga a quella descritta per il trasferimento delle funzioni.</w:t>
+        <w:t xml:space="preserve"> da trasferire da DB2 a DB3 sono state in totale 16. Ho optato quindi per un procedimento “manuale” di copia-incollaggio che è durato </w:t>
+      </w:r>
+      <w:proofErr w:type="gramStart"/>
+      <w:r>
+        <w:rPr>
+          <w:sz w:val="24"/>
+          <w:szCs w:val="24"/>
+        </w:rPr>
+        <w:t>5</w:t>
+      </w:r>
+      <w:proofErr w:type="gramEnd"/>
+      <w:r>
+        <w:rPr>
+          <w:sz w:val="24"/>
+          <w:szCs w:val="24"/>
+        </w:rPr>
+        <w:t xml:space="preserve"> minuti. In un’altra situazione, dove il copia-incollaggio dovesse risultare troppo oneroso, si può certamente eseguire una procedura analoga a quella descritta per il trasferimento delle funzioni.</w:t>
       </w:r>
     </w:p>
     <w:p>
@@ -2840,6 +3049,7 @@
         <w:t xml:space="preserve"> che sono in DB2 e che non sono in DB3 oppure tramite la solita funzione </w:t>
       </w:r>
       <w:proofErr w:type="spellStart"/>
+      <w:proofErr w:type="gramStart"/>
       <w:r>
         <w:rPr>
           <w:sz w:val="24"/>
@@ -2848,6 +3058,7 @@
         <w:t>cerca.vert</w:t>
       </w:r>
       <w:proofErr w:type="spellEnd"/>
+      <w:proofErr w:type="gramEnd"/>
       <w:r>
         <w:rPr>
           <w:sz w:val="24"/>
@@ -3283,15 +3494,31 @@
           <w:sz w:val="24"/>
           <w:szCs w:val="24"/>
         </w:rPr>
-        <w:t>grc_esporta_tabelle</w:t>
-      </w:r>
-      <w:proofErr w:type="spellEnd"/>
-      <w:r>
-        <w:rPr>
-          <w:sz w:val="24"/>
-          <w:szCs w:val="24"/>
-        </w:rPr>
-        <w:t>(‘codice azienda’, ‘codice partizione’).</w:t>
+        <w:t>grc_esporta_</w:t>
+      </w:r>
+      <w:proofErr w:type="gramStart"/>
+      <w:r>
+        <w:rPr>
+          <w:sz w:val="24"/>
+          <w:szCs w:val="24"/>
+        </w:rPr>
+        <w:t>tabelle</w:t>
+      </w:r>
+      <w:proofErr w:type="spellEnd"/>
+      <w:r>
+        <w:rPr>
+          <w:sz w:val="24"/>
+          <w:szCs w:val="24"/>
+        </w:rPr>
+        <w:t>(</w:t>
+      </w:r>
+      <w:proofErr w:type="gramEnd"/>
+      <w:r>
+        <w:rPr>
+          <w:sz w:val="24"/>
+          <w:szCs w:val="24"/>
+        </w:rPr>
+        <w:t>‘codice azienda’, ‘codice partizione’).</w:t>
       </w:r>
     </w:p>
     <w:p>
@@ -3436,15 +3663,31 @@
           <w:sz w:val="24"/>
           <w:szCs w:val="24"/>
         </w:rPr>
-        <w:t>grc_importa_tabelle</w:t>
-      </w:r>
-      <w:proofErr w:type="spellEnd"/>
-      <w:r>
-        <w:rPr>
-          <w:sz w:val="24"/>
-          <w:szCs w:val="24"/>
-        </w:rPr>
-        <w:t>(‘nome azienda’).</w:t>
+        <w:t>grc_importa_</w:t>
+      </w:r>
+      <w:proofErr w:type="gramStart"/>
+      <w:r>
+        <w:rPr>
+          <w:sz w:val="24"/>
+          <w:szCs w:val="24"/>
+        </w:rPr>
+        <w:t>tabelle</w:t>
+      </w:r>
+      <w:proofErr w:type="spellEnd"/>
+      <w:r>
+        <w:rPr>
+          <w:sz w:val="24"/>
+          <w:szCs w:val="24"/>
+        </w:rPr>
+        <w:t>(</w:t>
+      </w:r>
+      <w:proofErr w:type="gramEnd"/>
+      <w:r>
+        <w:rPr>
+          <w:sz w:val="24"/>
+          <w:szCs w:val="24"/>
+        </w:rPr>
+        <w:t>‘nome azienda’).</w:t>
       </w:r>
       <w:r>
         <w:rPr>
@@ -3478,22 +3721,36 @@
           <w:ilvl w:val="0"/>
           <w:numId w:val="1"/>
         </w:numPr>
-      </w:pPr>
-      <w:r>
+        <w:rPr>
+          <w:highlight w:val="yellow"/>
+        </w:rPr>
+      </w:pPr>
+      <w:r>
+        <w:rPr>
+          <w:highlight w:val="yellow"/>
+        </w:rPr>
         <w:t>Attività preliminari</w:t>
       </w:r>
-    </w:p>
-    <w:p>
-      <w:pPr>
-        <w:rPr>
-          <w:sz w:val="24"/>
-          <w:szCs w:val="24"/>
-        </w:rPr>
-      </w:pPr>
-      <w:r>
-        <w:rPr>
-          <w:sz w:val="24"/>
-          <w:szCs w:val="24"/>
+      <w:r>
+        <w:rPr>
+          <w:highlight w:val="yellow"/>
+        </w:rPr>
+        <w:t xml:space="preserve"> [SERVE?]</w:t>
+      </w:r>
+    </w:p>
+    <w:p>
+      <w:pPr>
+        <w:rPr>
+          <w:sz w:val="24"/>
+          <w:szCs w:val="24"/>
+          <w:highlight w:val="yellow"/>
+        </w:rPr>
+      </w:pPr>
+      <w:r>
+        <w:rPr>
+          <w:sz w:val="24"/>
+          <w:szCs w:val="24"/>
+          <w:highlight w:val="yellow"/>
         </w:rPr>
         <w:t xml:space="preserve">Di seguito le tabelle, sequenze, </w:t>
       </w:r>
@@ -3502,6 +3759,7 @@
         <w:rPr>
           <w:sz w:val="24"/>
           <w:szCs w:val="24"/>
+          <w:highlight w:val="yellow"/>
         </w:rPr>
         <w:t>view</w:t>
       </w:r>
@@ -3510,13 +3768,16 @@
         <w:rPr>
           <w:sz w:val="24"/>
           <w:szCs w:val="24"/>
+          <w:highlight w:val="yellow"/>
         </w:rPr>
         <w:t xml:space="preserve">, funzioni preliminari per </w:t>
       </w:r>
-      <w:r>
-        <w:rPr>
-          <w:sz w:val="24"/>
-          <w:szCs w:val="24"/>
+      <w:proofErr w:type="gramStart"/>
+      <w:r>
+        <w:rPr>
+          <w:sz w:val="24"/>
+          <w:szCs w:val="24"/>
+          <w:highlight w:val="yellow"/>
         </w:rPr>
         <w:t xml:space="preserve">le </w:t>
       </w:r>
@@ -3524,13 +3785,16 @@
         <w:rPr>
           <w:sz w:val="24"/>
           <w:szCs w:val="24"/>
+          <w:highlight w:val="yellow"/>
         </w:rPr>
         <w:t>importazione</w:t>
       </w:r>
-      <w:r>
-        <w:rPr>
-          <w:sz w:val="24"/>
-          <w:szCs w:val="24"/>
+      <w:proofErr w:type="gramEnd"/>
+      <w:r>
+        <w:rPr>
+          <w:sz w:val="24"/>
+          <w:szCs w:val="24"/>
+          <w:highlight w:val="yellow"/>
         </w:rPr>
         <w:t>/ esportazioni di singole azienda da un ambiente all’altro</w:t>
       </w:r>
@@ -3538,6 +3802,7 @@
         <w:rPr>
           <w:sz w:val="24"/>
           <w:szCs w:val="24"/>
+          <w:highlight w:val="yellow"/>
         </w:rPr>
         <w:t>.</w:t>
       </w:r>
@@ -3547,12 +3812,14 @@
         <w:rPr>
           <w:sz w:val="24"/>
           <w:szCs w:val="24"/>
-        </w:rPr>
-      </w:pPr>
-      <w:r>
-        <w:rPr>
-          <w:sz w:val="24"/>
-          <w:szCs w:val="24"/>
+          <w:highlight w:val="yellow"/>
+        </w:rPr>
+      </w:pPr>
+      <w:r>
+        <w:rPr>
+          <w:sz w:val="24"/>
+          <w:szCs w:val="24"/>
+          <w:highlight w:val="yellow"/>
         </w:rPr>
         <w:t xml:space="preserve">Tutti gli oggetti che seguono sono creabili tramite lo script </w:t>
       </w:r>
@@ -3562,24 +3829,43 @@
         <w:rPr>
           <w:sz w:val="24"/>
           <w:szCs w:val="24"/>
-        </w:rPr>
-      </w:pPr>
-      <w:r>
-        <w:rPr>
-          <w:sz w:val="24"/>
-          <w:szCs w:val="24"/>
-        </w:rPr>
-        <w:t>“01-funzioni_view_sequenze_import_export_aziende”</w:t>
-      </w:r>
-      <w:r>
-        <w:rPr>
-          <w:sz w:val="24"/>
-          <w:szCs w:val="24"/>
+          <w:highlight w:val="yellow"/>
+        </w:rPr>
+      </w:pPr>
+      <w:r>
+        <w:rPr>
+          <w:sz w:val="24"/>
+          <w:szCs w:val="24"/>
+          <w:highlight w:val="yellow"/>
+        </w:rPr>
+        <w:t>“01-funzioni_view_sequenze_import_export_az</w:t>
+      </w:r>
+      <w:bookmarkStart w:id="1" w:name="_GoBack"/>
+      <w:bookmarkEnd w:id="1"/>
+      <w:r>
+        <w:rPr>
+          <w:sz w:val="24"/>
+          <w:szCs w:val="24"/>
+          <w:highlight w:val="yellow"/>
+        </w:rPr>
+        <w:t>iende”</w:t>
+      </w:r>
+      <w:r>
+        <w:rPr>
+          <w:sz w:val="24"/>
+          <w:szCs w:val="24"/>
+          <w:highlight w:val="yellow"/>
         </w:rPr>
         <w:t>.</w:t>
       </w:r>
     </w:p>
-    <w:p/>
+    <w:p>
+      <w:pPr>
+        <w:rPr>
+          <w:highlight w:val="yellow"/>
+        </w:rPr>
+      </w:pPr>
+    </w:p>
     <w:tbl>
       <w:tblPr>
         <w:tblStyle w:val="Grigliatabella"/>
@@ -3601,12 +3887,14 @@
               <w:rPr>
                 <w:b/>
                 <w:bCs/>
+                <w:highlight w:val="yellow"/>
               </w:rPr>
             </w:pPr>
             <w:r>
               <w:rPr>
                 <w:b/>
                 <w:bCs/>
+                <w:highlight w:val="yellow"/>
               </w:rPr>
               <w:t>Nome oggetto</w:t>
             </w:r>
@@ -3621,12 +3909,14 @@
               <w:rPr>
                 <w:b/>
                 <w:bCs/>
+                <w:highlight w:val="yellow"/>
               </w:rPr>
             </w:pPr>
             <w:r>
               <w:rPr>
                 <w:b/>
                 <w:bCs/>
+                <w:highlight w:val="yellow"/>
               </w:rPr>
               <w:t>Tipo</w:t>
             </w:r>
@@ -3641,12 +3931,14 @@
               <w:rPr>
                 <w:b/>
                 <w:bCs/>
+                <w:highlight w:val="yellow"/>
               </w:rPr>
             </w:pPr>
             <w:r>
               <w:rPr>
                 <w:b/>
                 <w:bCs/>
+                <w:highlight w:val="yellow"/>
               </w:rPr>
               <w:t>File per crearle</w:t>
             </w:r>
@@ -3659,7 +3951,15 @@
             <w:tcW w:w="3802" w:type="dxa"/>
           </w:tcPr>
           <w:p>
+            <w:pPr>
+              <w:rPr>
+                <w:highlight w:val="yellow"/>
+              </w:rPr>
+            </w:pPr>
             <w:r>
+              <w:rPr>
+                <w:highlight w:val="yellow"/>
+              </w:rPr>
               <w:t>S01</w:t>
             </w:r>
           </w:p>
@@ -3669,7 +3969,15 @@
             <w:tcW w:w="1113" w:type="dxa"/>
           </w:tcPr>
           <w:p>
+            <w:pPr>
+              <w:rPr>
+                <w:highlight w:val="yellow"/>
+              </w:rPr>
+            </w:pPr>
             <w:r>
+              <w:rPr>
+                <w:highlight w:val="yellow"/>
+              </w:rPr>
               <w:t>Sequenza</w:t>
             </w:r>
           </w:p>
@@ -3679,7 +3987,15 @@
             <w:tcW w:w="4713" w:type="dxa"/>
           </w:tcPr>
           <w:p>
+            <w:pPr>
+              <w:rPr>
+                <w:highlight w:val="yellow"/>
+              </w:rPr>
+            </w:pPr>
             <w:r>
+              <w:rPr>
+                <w:highlight w:val="yellow"/>
+              </w:rPr>
               <w:t>01-funzioni_view_sequenze_import_export_aziende</w:t>
             </w:r>
           </w:p>
@@ -3691,7 +4007,15 @@
             <w:tcW w:w="3802" w:type="dxa"/>
           </w:tcPr>
           <w:p>
+            <w:pPr>
+              <w:rPr>
+                <w:highlight w:val="yellow"/>
+              </w:rPr>
+            </w:pPr>
             <w:r>
+              <w:rPr>
+                <w:highlight w:val="yellow"/>
+              </w:rPr>
               <w:t>Tabelle</w:t>
             </w:r>
           </w:p>
@@ -3701,7 +4025,15 @@
             <w:tcW w:w="1113" w:type="dxa"/>
           </w:tcPr>
           <w:p>
+            <w:pPr>
+              <w:rPr>
+                <w:highlight w:val="yellow"/>
+              </w:rPr>
+            </w:pPr>
             <w:r>
+              <w:rPr>
+                <w:highlight w:val="yellow"/>
+              </w:rPr>
               <w:t>Tabella</w:t>
             </w:r>
           </w:p>
@@ -3711,7 +4043,15 @@
             <w:tcW w:w="4713" w:type="dxa"/>
           </w:tcPr>
           <w:p>
+            <w:pPr>
+              <w:rPr>
+                <w:highlight w:val="yellow"/>
+              </w:rPr>
+            </w:pPr>
             <w:r>
+              <w:rPr>
+                <w:highlight w:val="yellow"/>
+              </w:rPr>
               <w:t>01-funzioni_view_sequenze_import_export_aziende</w:t>
             </w:r>
           </w:p>
@@ -3723,12 +4063,23 @@
             <w:tcW w:w="3802" w:type="dxa"/>
           </w:tcPr>
           <w:p>
+            <w:pPr>
+              <w:rPr>
+                <w:highlight w:val="yellow"/>
+              </w:rPr>
+            </w:pPr>
             <w:proofErr w:type="spellStart"/>
             <w:r>
+              <w:rPr>
+                <w:highlight w:val="yellow"/>
+              </w:rPr>
               <w:t>grc_tabella_ca_cp_nulla</w:t>
             </w:r>
             <w:proofErr w:type="spellEnd"/>
             <w:r>
+              <w:rPr>
+                <w:highlight w:val="yellow"/>
+              </w:rPr>
               <w:t>(text)</w:t>
             </w:r>
           </w:p>
@@ -3738,7 +4089,15 @@
             <w:tcW w:w="1113" w:type="dxa"/>
           </w:tcPr>
           <w:p>
+            <w:pPr>
+              <w:rPr>
+                <w:highlight w:val="yellow"/>
+              </w:rPr>
+            </w:pPr>
             <w:r>
+              <w:rPr>
+                <w:highlight w:val="yellow"/>
+              </w:rPr>
               <w:t>Funzione</w:t>
             </w:r>
           </w:p>
@@ -3748,7 +4107,15 @@
             <w:tcW w:w="4713" w:type="dxa"/>
           </w:tcPr>
           <w:p>
+            <w:pPr>
+              <w:rPr>
+                <w:highlight w:val="yellow"/>
+              </w:rPr>
+            </w:pPr>
             <w:r>
+              <w:rPr>
+                <w:highlight w:val="yellow"/>
+              </w:rPr>
               <w:t>01-funzioni_view_sequenze_import_export_aziende</w:t>
             </w:r>
           </w:p>
@@ -3760,8 +4127,16 @@
             <w:tcW w:w="3802" w:type="dxa"/>
           </w:tcPr>
           <w:p>
+            <w:pPr>
+              <w:rPr>
+                <w:highlight w:val="yellow"/>
+              </w:rPr>
+            </w:pPr>
             <w:proofErr w:type="spellStart"/>
             <w:r>
+              <w:rPr>
+                <w:highlight w:val="yellow"/>
+              </w:rPr>
               <w:t>entrasp.grc_esporta_tabelle</w:t>
             </w:r>
             <w:proofErr w:type="spellEnd"/>
@@ -3772,7 +4147,15 @@
             <w:tcW w:w="1113" w:type="dxa"/>
           </w:tcPr>
           <w:p>
+            <w:pPr>
+              <w:rPr>
+                <w:highlight w:val="yellow"/>
+              </w:rPr>
+            </w:pPr>
             <w:r>
+              <w:rPr>
+                <w:highlight w:val="yellow"/>
+              </w:rPr>
               <w:t>Funzione</w:t>
             </w:r>
           </w:p>
@@ -3782,7 +4165,15 @@
             <w:tcW w:w="4713" w:type="dxa"/>
           </w:tcPr>
           <w:p>
+            <w:pPr>
+              <w:rPr>
+                <w:highlight w:val="yellow"/>
+              </w:rPr>
+            </w:pPr>
             <w:r>
+              <w:rPr>
+                <w:highlight w:val="yellow"/>
+              </w:rPr>
               <w:t>01-funzioni_view_sequenze_import_export_aziende</w:t>
             </w:r>
           </w:p>
@@ -3794,8 +4185,16 @@
             <w:tcW w:w="3802" w:type="dxa"/>
           </w:tcPr>
           <w:p>
+            <w:pPr>
+              <w:rPr>
+                <w:highlight w:val="yellow"/>
+              </w:rPr>
+            </w:pPr>
             <w:proofErr w:type="spellStart"/>
             <w:r>
+              <w:rPr>
+                <w:highlight w:val="yellow"/>
+              </w:rPr>
               <w:t>grc_importa_tabelle</w:t>
             </w:r>
             <w:proofErr w:type="spellEnd"/>
@@ -3806,7 +4205,15 @@
             <w:tcW w:w="1113" w:type="dxa"/>
           </w:tcPr>
           <w:p>
+            <w:pPr>
+              <w:rPr>
+                <w:highlight w:val="yellow"/>
+              </w:rPr>
+            </w:pPr>
             <w:r>
+              <w:rPr>
+                <w:highlight w:val="yellow"/>
+              </w:rPr>
               <w:t>Funzione</w:t>
             </w:r>
           </w:p>
@@ -3816,7 +4223,15 @@
             <w:tcW w:w="4713" w:type="dxa"/>
           </w:tcPr>
           <w:p>
+            <w:pPr>
+              <w:rPr>
+                <w:highlight w:val="yellow"/>
+              </w:rPr>
+            </w:pPr>
             <w:r>
+              <w:rPr>
+                <w:highlight w:val="yellow"/>
+              </w:rPr>
               <w:t>01-funzioni_view_sequenze_import_export_aziende</w:t>
             </w:r>
           </w:p>
@@ -3828,8 +4243,16 @@
             <w:tcW w:w="3802" w:type="dxa"/>
           </w:tcPr>
           <w:p>
+            <w:pPr>
+              <w:rPr>
+                <w:highlight w:val="yellow"/>
+              </w:rPr>
+            </w:pPr>
             <w:proofErr w:type="spellStart"/>
             <w:r>
+              <w:rPr>
+                <w:highlight w:val="yellow"/>
+              </w:rPr>
               <w:t>entrasp.grc_listacampiditabella</w:t>
             </w:r>
             <w:proofErr w:type="spellEnd"/>
@@ -3840,7 +4263,15 @@
             <w:tcW w:w="1113" w:type="dxa"/>
           </w:tcPr>
           <w:p>
+            <w:pPr>
+              <w:rPr>
+                <w:highlight w:val="yellow"/>
+              </w:rPr>
+            </w:pPr>
             <w:r>
+              <w:rPr>
+                <w:highlight w:val="yellow"/>
+              </w:rPr>
               <w:t>Funzione</w:t>
             </w:r>
           </w:p>
@@ -3850,7 +4281,15 @@
             <w:tcW w:w="4713" w:type="dxa"/>
           </w:tcPr>
           <w:p>
+            <w:pPr>
+              <w:rPr>
+                <w:highlight w:val="yellow"/>
+              </w:rPr>
+            </w:pPr>
             <w:r>
+              <w:rPr>
+                <w:highlight w:val="yellow"/>
+              </w:rPr>
               <w:t>01-funzioni_view_sequenze_import_export_aziende</w:t>
             </w:r>
           </w:p>
@@ -3862,8 +4301,16 @@
             <w:tcW w:w="3802" w:type="dxa"/>
           </w:tcPr>
           <w:p>
+            <w:pPr>
+              <w:rPr>
+                <w:highlight w:val="yellow"/>
+              </w:rPr>
+            </w:pPr>
             <w:proofErr w:type="spellStart"/>
             <w:r>
+              <w:rPr>
+                <w:highlight w:val="yellow"/>
+              </w:rPr>
               <w:t>entrasp.grc_listacampiditabella_non_pk</w:t>
             </w:r>
             <w:proofErr w:type="spellEnd"/>
@@ -3874,7 +4321,15 @@
             <w:tcW w:w="1113" w:type="dxa"/>
           </w:tcPr>
           <w:p>
+            <w:pPr>
+              <w:rPr>
+                <w:highlight w:val="yellow"/>
+              </w:rPr>
+            </w:pPr>
             <w:r>
+              <w:rPr>
+                <w:highlight w:val="yellow"/>
+              </w:rPr>
               <w:t>Funzione</w:t>
             </w:r>
           </w:p>
@@ -3884,7 +4339,15 @@
             <w:tcW w:w="4713" w:type="dxa"/>
           </w:tcPr>
           <w:p>
+            <w:pPr>
+              <w:rPr>
+                <w:highlight w:val="yellow"/>
+              </w:rPr>
+            </w:pPr>
             <w:r>
+              <w:rPr>
+                <w:highlight w:val="yellow"/>
+              </w:rPr>
               <w:t>01-funzioni_view_sequenze_import_export_aziende</w:t>
             </w:r>
           </w:p>
@@ -3896,8 +4359,16 @@
             <w:tcW w:w="3802" w:type="dxa"/>
           </w:tcPr>
           <w:p>
+            <w:pPr>
+              <w:rPr>
+                <w:highlight w:val="yellow"/>
+              </w:rPr>
+            </w:pPr>
             <w:proofErr w:type="spellStart"/>
             <w:r>
+              <w:rPr>
+                <w:highlight w:val="yellow"/>
+              </w:rPr>
               <w:t>entrasp.grc_listacampiditabella_pk</w:t>
             </w:r>
             <w:proofErr w:type="spellEnd"/>
@@ -3908,7 +4379,15 @@
             <w:tcW w:w="1113" w:type="dxa"/>
           </w:tcPr>
           <w:p>
+            <w:pPr>
+              <w:rPr>
+                <w:highlight w:val="yellow"/>
+              </w:rPr>
+            </w:pPr>
             <w:r>
+              <w:rPr>
+                <w:highlight w:val="yellow"/>
+              </w:rPr>
               <w:t>Funzione</w:t>
             </w:r>
           </w:p>
@@ -3918,7 +4397,15 @@
             <w:tcW w:w="4713" w:type="dxa"/>
           </w:tcPr>
           <w:p>
+            <w:pPr>
+              <w:rPr>
+                <w:highlight w:val="yellow"/>
+              </w:rPr>
+            </w:pPr>
             <w:r>
+              <w:rPr>
+                <w:highlight w:val="yellow"/>
+              </w:rPr>
               <w:t>01-funzioni_view_sequenze_import_export_aziende</w:t>
             </w:r>
           </w:p>
@@ -3930,8 +4417,16 @@
             <w:tcW w:w="3802" w:type="dxa"/>
           </w:tcPr>
           <w:p>
+            <w:pPr>
+              <w:rPr>
+                <w:highlight w:val="yellow"/>
+              </w:rPr>
+            </w:pPr>
             <w:proofErr w:type="spellStart"/>
             <w:r>
+              <w:rPr>
+                <w:highlight w:val="yellow"/>
+              </w:rPr>
               <w:t>grc_tabelle</w:t>
             </w:r>
             <w:proofErr w:type="spellEnd"/>
@@ -3942,8 +4437,16 @@
             <w:tcW w:w="1113" w:type="dxa"/>
           </w:tcPr>
           <w:p>
+            <w:pPr>
+              <w:rPr>
+                <w:highlight w:val="yellow"/>
+              </w:rPr>
+            </w:pPr>
             <w:proofErr w:type="spellStart"/>
             <w:r>
+              <w:rPr>
+                <w:highlight w:val="yellow"/>
+              </w:rPr>
               <w:t>View</w:t>
             </w:r>
             <w:proofErr w:type="spellEnd"/>
@@ -3954,7 +4457,15 @@
             <w:tcW w:w="4713" w:type="dxa"/>
           </w:tcPr>
           <w:p>
+            <w:pPr>
+              <w:rPr>
+                <w:highlight w:val="yellow"/>
+              </w:rPr>
+            </w:pPr>
             <w:r>
+              <w:rPr>
+                <w:highlight w:val="yellow"/>
+              </w:rPr>
               <w:t>01-funzioni_view_sequenze_import_export_aziende</w:t>
             </w:r>
           </w:p>
@@ -3966,8 +4477,16 @@
             <w:tcW w:w="3802" w:type="dxa"/>
           </w:tcPr>
           <w:p>
+            <w:pPr>
+              <w:rPr>
+                <w:highlight w:val="yellow"/>
+              </w:rPr>
+            </w:pPr>
             <w:proofErr w:type="spellStart"/>
             <w:r>
+              <w:rPr>
+                <w:highlight w:val="yellow"/>
+              </w:rPr>
               <w:t>grc_tabelle_ca_cp</w:t>
             </w:r>
             <w:proofErr w:type="spellEnd"/>
@@ -3978,8 +4497,16 @@
             <w:tcW w:w="1113" w:type="dxa"/>
           </w:tcPr>
           <w:p>
+            <w:pPr>
+              <w:rPr>
+                <w:highlight w:val="yellow"/>
+              </w:rPr>
+            </w:pPr>
             <w:proofErr w:type="spellStart"/>
             <w:r>
+              <w:rPr>
+                <w:highlight w:val="yellow"/>
+              </w:rPr>
               <w:t>View</w:t>
             </w:r>
             <w:proofErr w:type="spellEnd"/>
@@ -3990,33 +4517,68 @@
             <w:tcW w:w="4713" w:type="dxa"/>
           </w:tcPr>
           <w:p>
+            <w:pPr>
+              <w:rPr>
+                <w:highlight w:val="yellow"/>
+              </w:rPr>
+            </w:pPr>
             <w:r>
+              <w:rPr>
+                <w:highlight w:val="yellow"/>
+              </w:rPr>
               <w:t>01-funzioni_view_sequenze_import_export_aziende</w:t>
             </w:r>
           </w:p>
         </w:tc>
       </w:tr>
     </w:tbl>
-    <w:p/>
-    <w:p>
-      <w:pPr>
-        <w:rPr>
-          <w:sz w:val="24"/>
-          <w:szCs w:val="24"/>
-        </w:rPr>
-      </w:pPr>
-      <w:r>
-        <w:rPr>
-          <w:sz w:val="24"/>
-          <w:szCs w:val="24"/>
-        </w:rPr>
-        <w:t xml:space="preserve">[FATTO DA SILVIO].Le </w:t>
-      </w:r>
-      <w:proofErr w:type="spellStart"/>
-      <w:r>
-        <w:rPr>
-          <w:sz w:val="24"/>
-          <w:szCs w:val="24"/>
+    <w:p>
+      <w:pPr>
+        <w:rPr>
+          <w:highlight w:val="yellow"/>
+        </w:rPr>
+      </w:pPr>
+    </w:p>
+    <w:p>
+      <w:pPr>
+        <w:rPr>
+          <w:sz w:val="24"/>
+          <w:szCs w:val="24"/>
+          <w:highlight w:val="yellow"/>
+        </w:rPr>
+      </w:pPr>
+      <w:r>
+        <w:rPr>
+          <w:sz w:val="24"/>
+          <w:szCs w:val="24"/>
+          <w:highlight w:val="yellow"/>
+        </w:rPr>
+        <w:t>[FATTO DA SILVIO</w:t>
+      </w:r>
+      <w:proofErr w:type="gramStart"/>
+      <w:r>
+        <w:rPr>
+          <w:sz w:val="24"/>
+          <w:szCs w:val="24"/>
+          <w:highlight w:val="yellow"/>
+        </w:rPr>
+        <w:t>].Le</w:t>
+      </w:r>
+      <w:proofErr w:type="gramEnd"/>
+      <w:r>
+        <w:rPr>
+          <w:sz w:val="24"/>
+          <w:szCs w:val="24"/>
+          <w:highlight w:val="yellow"/>
+        </w:rPr>
+        <w:t xml:space="preserve"> </w:t>
+      </w:r>
+      <w:proofErr w:type="spellStart"/>
+      <w:r>
+        <w:rPr>
+          <w:sz w:val="24"/>
+          <w:szCs w:val="24"/>
+          <w:highlight w:val="yellow"/>
         </w:rPr>
         <w:t>view</w:t>
       </w:r>
@@ -4025,14 +4587,34 @@
         <w:rPr>
           <w:sz w:val="24"/>
           <w:szCs w:val="24"/>
-        </w:rPr>
-        <w:t>, tabelle e la sequenza (credo sia la sequenza s10, non la sequenza s01) sono state aggiunte. E’ stato comunque fatto un file word “</w:t>
-      </w:r>
-      <w:proofErr w:type="spellStart"/>
-      <w:r>
-        <w:rPr>
-          <w:sz w:val="24"/>
-          <w:szCs w:val="24"/>
+          <w:highlight w:val="yellow"/>
+        </w:rPr>
+        <w:t xml:space="preserve">, tabelle e la sequenza (credo sia la sequenza s10, non la sequenza s01) sono state aggiunte. </w:t>
+      </w:r>
+      <w:proofErr w:type="gramStart"/>
+      <w:r>
+        <w:rPr>
+          <w:sz w:val="24"/>
+          <w:szCs w:val="24"/>
+          <w:highlight w:val="yellow"/>
+        </w:rPr>
+        <w:t>E’</w:t>
+      </w:r>
+      <w:proofErr w:type="gramEnd"/>
+      <w:r>
+        <w:rPr>
+          <w:sz w:val="24"/>
+          <w:szCs w:val="24"/>
+          <w:highlight w:val="yellow"/>
+        </w:rPr>
+        <w:t xml:space="preserve"> stato comunque fatto un file word “</w:t>
+      </w:r>
+      <w:proofErr w:type="spellStart"/>
+      <w:r>
+        <w:rPr>
+          <w:sz w:val="24"/>
+          <w:szCs w:val="24"/>
+          <w:highlight w:val="yellow"/>
         </w:rPr>
         <w:t>seq_tab_fun_view</w:t>
       </w:r>
@@ -4041,14 +4623,25 @@
         <w:rPr>
           <w:sz w:val="24"/>
           <w:szCs w:val="24"/>
-        </w:rPr>
-        <w:t xml:space="preserve">” contenente tutti gli SQL necessari ad aggiungere tali sequenze, tabelle, funzioni e </w:t>
-      </w:r>
-      <w:proofErr w:type="spellStart"/>
-      <w:r>
-        <w:rPr>
-          <w:sz w:val="24"/>
-          <w:szCs w:val="24"/>
+          <w:highlight w:val="yellow"/>
+        </w:rPr>
+        <w:t xml:space="preserve">” contenente tutti gli </w:t>
+      </w:r>
+      <w:r>
+        <w:rPr>
+          <w:sz w:val="24"/>
+          <w:szCs w:val="24"/>
+          <w:highlight w:val="yellow"/>
+        </w:rPr>
+        <w:lastRenderedPageBreak/>
+        <w:t xml:space="preserve">SQL necessari ad aggiungere tali sequenze, tabelle, funzioni e </w:t>
+      </w:r>
+      <w:proofErr w:type="spellStart"/>
+      <w:r>
+        <w:rPr>
+          <w:sz w:val="24"/>
+          <w:szCs w:val="24"/>
+          <w:highlight w:val="yellow"/>
         </w:rPr>
         <w:t>view</w:t>
       </w:r>
@@ -4057,6 +4650,7 @@
         <w:rPr>
           <w:sz w:val="24"/>
           <w:szCs w:val="24"/>
+          <w:highlight w:val="yellow"/>
         </w:rPr>
         <w:t xml:space="preserve"> per backup e comodità futura (almeno credo) con all’interno le istruzioni necessarie all’importazione.</w:t>
       </w:r>
@@ -4068,17 +4662,29 @@
           <w:szCs w:val="24"/>
         </w:rPr>
       </w:pPr>
-      <w:r>
-        <w:rPr>
-          <w:sz w:val="24"/>
-          <w:szCs w:val="24"/>
-        </w:rPr>
-        <w:t>E’ altresì necessario importare i valori della tabella denominata “Tabelle” tramite il file denominato “tabelle.csv”</w:t>
-      </w:r>
-      <w:r>
-        <w:rPr>
-          <w:sz w:val="24"/>
-          <w:szCs w:val="24"/>
+      <w:proofErr w:type="gramStart"/>
+      <w:r>
+        <w:rPr>
+          <w:sz w:val="24"/>
+          <w:szCs w:val="24"/>
+          <w:highlight w:val="yellow"/>
+        </w:rPr>
+        <w:t>E’</w:t>
+      </w:r>
+      <w:proofErr w:type="gramEnd"/>
+      <w:r>
+        <w:rPr>
+          <w:sz w:val="24"/>
+          <w:szCs w:val="24"/>
+          <w:highlight w:val="yellow"/>
+        </w:rPr>
+        <w:t xml:space="preserve"> altresì necessario importare i valori della tabella denominata “Tabelle” tramite il file denominato “tabelle.csv”</w:t>
+      </w:r>
+      <w:r>
+        <w:rPr>
+          <w:sz w:val="24"/>
+          <w:szCs w:val="24"/>
+          <w:highlight w:val="yellow"/>
         </w:rPr>
         <w:sym w:font="Wingdings" w:char="F0DF"/>
       </w:r>
@@ -4086,6 +4692,7 @@
         <w:rPr>
           <w:sz w:val="24"/>
           <w:szCs w:val="24"/>
+          <w:highlight w:val="yellow"/>
         </w:rPr>
         <w:t xml:space="preserve"> [FATTO DA SILVIO]</w:t>
       </w:r>
@@ -4093,6 +4700,7 @@
         <w:rPr>
           <w:sz w:val="24"/>
           <w:szCs w:val="24"/>
+          <w:highlight w:val="yellow"/>
         </w:rPr>
         <w:t>.</w:t>
       </w:r>

</xml_diff>